<commit_message>
Noted some explanation behind results
Compared the verification results and wrote some observations
</commit_message>
<xml_diff>
--- a/2nd Step/Explanation behind Comparison.docx
+++ b/2nd Step/Explanation behind Comparison.docx
@@ -303,6 +303,284 @@
       <w:proofErr w:type="spellEnd"/>
       <w:r>
         <w:t>: A text list of the new insights the AI caught. (This is great for your presentation, as it shows where the AI actually adds value beyond a human grader!)</w:t>
+      </w:r>
+    </w:p>
+    <w:p/>
+    <w:p>
+      <w:r>
+        <w:br w:type="page"/>
+      </w:r>
+    </w:p>
+    <w:p>
+      <w:r>
+        <w:lastRenderedPageBreak/>
+        <w:t>1. Why are there blanks or 0s in the results?</w:t>
+      </w:r>
+    </w:p>
+    <w:p>
+      <w:r>
+        <w:t>0</w:t>
+      </w:r>
+      <w:r>
+        <w:t>/</w:t>
+      </w:r>
+      <w:r>
+        <w:t xml:space="preserve">blank text box simply mean no bullet points were successfully extracted for that specific cell. </w:t>
+      </w:r>
+    </w:p>
+    <w:p>
+      <w:r>
+        <w:t>This happens for a few reasons:</w:t>
+      </w:r>
+    </w:p>
+    <w:p>
+      <w:pPr>
+        <w:pStyle w:val="ListParagraph"/>
+        <w:numPr>
+          <w:ilvl w:val="0"/>
+          <w:numId w:val="5"/>
+        </w:numPr>
+      </w:pPr>
+      <w:r>
+        <w:t>The original human or AI feedback was blank: If a specific dimension (like "Social impact") wasn't applicable to a specific essay, the graders likely left it blank. Nothing to count = 0.</w:t>
+      </w:r>
+    </w:p>
+    <w:p>
+      <w:pPr>
+        <w:pStyle w:val="ListParagraph"/>
+        <w:numPr>
+          <w:ilvl w:val="0"/>
+          <w:numId w:val="5"/>
+        </w:numPr>
+      </w:pPr>
+      <w:r>
+        <w:t xml:space="preserve">Perfect Alignment (for the "Missed" columns): If the </w:t>
+      </w:r>
+      <w:proofErr w:type="spellStart"/>
+      <w:r>
+        <w:t>Human_Only</w:t>
+      </w:r>
+      <w:proofErr w:type="spellEnd"/>
+      <w:r>
+        <w:t xml:space="preserve"> and </w:t>
+      </w:r>
+      <w:proofErr w:type="spellStart"/>
+      <w:r>
+        <w:t>AI_Only</w:t>
+      </w:r>
+      <w:proofErr w:type="spellEnd"/>
+      <w:r>
+        <w:t xml:space="preserve"> columns are 0, it means the AI and human agreed perfectly and neither missed anything!</w:t>
+      </w:r>
+    </w:p>
+    <w:p/>
+    <w:p>
+      <w:r>
+        <w:t xml:space="preserve">2. Is the AI or the Human </w:t>
+      </w:r>
+      <w:proofErr w:type="gramStart"/>
+      <w:r>
+        <w:t>more strict</w:t>
+      </w:r>
+      <w:proofErr w:type="gramEnd"/>
+      <w:r>
+        <w:t>?</w:t>
+      </w:r>
+    </w:p>
+    <w:p>
+      <w:r>
+        <w:t>It depends on the specific dimension. By analyzing the _</w:t>
+      </w:r>
+      <w:proofErr w:type="spellStart"/>
+      <w:r>
+        <w:t>Score_Difference</w:t>
+      </w:r>
+      <w:proofErr w:type="spellEnd"/>
+      <w:r>
+        <w:t xml:space="preserve"> columns across all 283 essays, a fascinating pattern emerges. Remember, a positive difference means the AI was stricter (gave a lower grade), and a negative difference means the AI was more lenient (gave a higher grade).</w:t>
+      </w:r>
+    </w:p>
+    <w:p/>
+    <w:p>
+      <w:r>
+        <w:t>Where the AI is STRICTER than the human:</w:t>
+      </w:r>
+    </w:p>
+    <w:p>
+      <w:r>
+        <w:t>The AI grades harsher on dimensions that involve counting or scanning for distinct viewpoints.</w:t>
+      </w:r>
+    </w:p>
+    <w:p>
+      <w:pPr>
+        <w:pStyle w:val="ListParagraph"/>
+        <w:numPr>
+          <w:ilvl w:val="0"/>
+          <w:numId w:val="6"/>
+        </w:numPr>
+      </w:pPr>
+      <w:r>
+        <w:t xml:space="preserve">Number of disciplinary </w:t>
+      </w:r>
+      <w:proofErr w:type="gramStart"/>
+      <w:r>
+        <w:t>integration</w:t>
+      </w:r>
+      <w:proofErr w:type="gramEnd"/>
+      <w:r>
+        <w:t>: The AI was stricter on 173 essays. It likely requires explicit proof of integration, whereas humans might be more forgiving.</w:t>
+      </w:r>
+    </w:p>
+    <w:p>
+      <w:pPr>
+        <w:pStyle w:val="ListParagraph"/>
+        <w:numPr>
+          <w:ilvl w:val="0"/>
+          <w:numId w:val="6"/>
+        </w:numPr>
+      </w:pPr>
+      <w:r>
+        <w:t>Stakeholder consideration: The AI graded lower than the human on 141 essays.</w:t>
+      </w:r>
+    </w:p>
+    <w:p>
+      <w:pPr>
+        <w:pStyle w:val="ListParagraph"/>
+        <w:numPr>
+          <w:ilvl w:val="0"/>
+          <w:numId w:val="6"/>
+        </w:numPr>
+      </w:pPr>
+      <w:r>
+        <w:t>Range of disciplinary perspectives: The AI was stricter on 117 essays.</w:t>
+      </w:r>
+    </w:p>
+    <w:p/>
+    <w:p>
+      <w:r>
+        <w:t>Where the AI is MORE LENIENT (Generous) than the human:</w:t>
+      </w:r>
+    </w:p>
+    <w:p>
+      <w:r>
+        <w:t>The AI tends to give higher scores on qualitative, abstract dimensions.</w:t>
+      </w:r>
+    </w:p>
+    <w:p>
+      <w:pPr>
+        <w:pStyle w:val="ListParagraph"/>
+        <w:numPr>
+          <w:ilvl w:val="0"/>
+          <w:numId w:val="7"/>
+        </w:numPr>
+      </w:pPr>
+      <w:r>
+        <w:t>Social impact: The AI gave a higher score on 151 essays. It is very generous here!</w:t>
+      </w:r>
+    </w:p>
+    <w:p>
+      <w:pPr>
+        <w:pStyle w:val="ListParagraph"/>
+        <w:numPr>
+          <w:ilvl w:val="0"/>
+          <w:numId w:val="7"/>
+        </w:numPr>
+      </w:pPr>
+      <w:r>
+        <w:t>Frame the problem: The AI gave a higher score on 173 essays.</w:t>
+      </w:r>
+    </w:p>
+    <w:p>
+      <w:pPr>
+        <w:pStyle w:val="ListParagraph"/>
+        <w:numPr>
+          <w:ilvl w:val="0"/>
+          <w:numId w:val="7"/>
+        </w:numPr>
+      </w:pPr>
+      <w:r>
+        <w:t>Disciplinary reasoning: The AI gave a higher score on 127 essays.</w:t>
+      </w:r>
+    </w:p>
+    <w:p>
+      <w:pPr>
+        <w:pStyle w:val="ListParagraph"/>
+        <w:numPr>
+          <w:ilvl w:val="0"/>
+          <w:numId w:val="7"/>
+        </w:numPr>
+      </w:pPr>
+      <w:r>
+        <w:t>Credibility of disciplinary knowledge: The AI gave a higher score on 128 essays.</w:t>
+      </w:r>
+    </w:p>
+    <w:p/>
+    <w:p>
+      <w:r>
+        <w:br w:type="page"/>
+      </w:r>
+    </w:p>
+    <w:p>
+      <w:r>
+        <w:lastRenderedPageBreak/>
+        <w:t>What this means for your app: The AI is very good at identifying if a student missed a specific stakeholder or didn't bring in enough perspectives. However, it might be too nice when judging abstract concepts like "Social Impact" or "Reasoning". You might need to adjust your AI prompt to be slightly more critical in those areas.</w:t>
+      </w:r>
+    </w:p>
+    <w:p/>
+    <w:p>
+      <w:r>
+        <w:t>3. What else do these results tell you? (Great for your FYP Presentation)</w:t>
+      </w:r>
+    </w:p>
+    <w:p>
+      <w:r>
+        <w:t>I ran a quick analysis on your _</w:t>
+      </w:r>
+      <w:proofErr w:type="spellStart"/>
+      <w:r>
+        <w:t>AI_Only_Count</w:t>
+      </w:r>
+      <w:proofErr w:type="spellEnd"/>
+      <w:r>
+        <w:t xml:space="preserve"> vs _</w:t>
+      </w:r>
+      <w:proofErr w:type="spellStart"/>
+      <w:r>
+        <w:t>Human_Only_Count</w:t>
+      </w:r>
+      <w:proofErr w:type="spellEnd"/>
+      <w:r>
+        <w:t xml:space="preserve"> totals across the entire spreadsheet.</w:t>
+      </w:r>
+    </w:p>
+    <w:p>
+      <w:pPr>
+        <w:pStyle w:val="ListParagraph"/>
+        <w:numPr>
+          <w:ilvl w:val="0"/>
+          <w:numId w:val="8"/>
+        </w:numPr>
+      </w:pPr>
+      <w:r>
+        <w:t>Total points ONLY the human found: ~10,270 points</w:t>
+      </w:r>
+    </w:p>
+    <w:p>
+      <w:pPr>
+        <w:pStyle w:val="ListParagraph"/>
+        <w:numPr>
+          <w:ilvl w:val="0"/>
+          <w:numId w:val="8"/>
+        </w:numPr>
+      </w:pPr>
+      <w:r>
+        <w:t>Total points ONLY the AI found: ~32,910 points</w:t>
+      </w:r>
+    </w:p>
+    <w:p/>
+    <w:p>
+      <w:r>
+        <w:t>The Takeaway: The AI is providing roughly 3 times more feedback than the human graders. Human graders often suffer from fatigue—especially when grading 283 essays—so they might just leave a brief comment like "Good integration." The AI, however, never gets tired and writes incredibly detailed, granular feedback for every single rubric dimension.</w:t>
       </w:r>
     </w:p>
     <w:sectPr>
@@ -318,6 +596,119 @@
 <file path=word/numbering.xml><?xml version="1.0" encoding="utf-8"?>
 <w:numbering xmlns:wpc="http://schemas.microsoft.com/office/word/2010/wordprocessingCanvas" xmlns:cx="http://schemas.microsoft.com/office/drawing/2014/chartex" xmlns:cx1="http://schemas.microsoft.com/office/drawing/2015/9/8/chartex" xmlns:cx2="http://schemas.microsoft.com/office/drawing/2015/10/21/chartex" xmlns:cx3="http://schemas.microsoft.com/office/drawing/2016/5/9/chartex" xmlns:cx4="http://schemas.microsoft.com/office/drawing/2016/5/10/chartex" xmlns:cx5="http://schemas.microsoft.com/office/drawing/2016/5/11/chartex" xmlns:cx6="http://schemas.microsoft.com/office/drawing/2016/5/12/chartex" xmlns:cx7="http://schemas.microsoft.com/office/drawing/2016/5/13/chartex" xmlns:cx8="http://schemas.microsoft.com/office/drawing/2016/5/14/chartex" xmlns:mc="http://schemas.openxmlformats.org/markup-compatibility/2006" xmlns:aink="http://schemas.microsoft.com/office/drawing/2016/ink" xmlns:am3d="http://schemas.microsoft.com/office/drawing/2017/model3d" xmlns:o="urn:schemas-microsoft-com:office:office" xmlns:oel="http://schemas.microsoft.com/office/2019/extlst" xmlns:r="http://schemas.openxmlformats.org/officeDocument/2006/relationships" xmlns:m="http://schemas.openxmlformats.org/officeDocument/2006/math" xmlns:v="urn:schemas-microsoft-com:vml" xmlns:wp14="http://schemas.microsoft.com/office/word/2010/wordprocessingDrawing" xmlns:wp="http://schemas.openxmlformats.org/drawingml/2006/wordprocessingDrawing" xmlns:w10="urn:schemas-microsoft-com:office:word" xmlns:w="http://schemas.openxmlformats.org/wordprocessingml/2006/main" xmlns:w14="http://schemas.microsoft.com/office/word/2010/wordml" xmlns:w15="http://schemas.microsoft.com/office/word/2012/wordml" xmlns:w16cex="http://schemas.microsoft.com/office/word/2018/wordml/cex" xmlns:w16cid="http://schemas.microsoft.com/office/word/2016/wordml/cid" xmlns:w16="http://schemas.microsoft.com/office/word/2018/wordml" xmlns:w16du="http://schemas.microsoft.com/office/word/2023/wordml/word16du" xmlns:w16sdtdh="http://schemas.microsoft.com/office/word/2020/wordml/sdtdatahash" xmlns:w16sdtfl="http://schemas.microsoft.com/office/word/2024/wordml/sdtformatlock" xmlns:w16se="http://schemas.microsoft.com/office/word/2015/wordml/symex" xmlns:wpg="http://schemas.microsoft.com/office/word/2010/wordprocessingGroup" xmlns:wpi="http://schemas.microsoft.com/office/word/2010/wordprocessingInk" xmlns:wne="http://schemas.microsoft.com/office/word/2006/wordml" xmlns:wps="http://schemas.microsoft.com/office/word/2010/wordprocessingShape" mc:Ignorable="w14 w15 w16se w16cid w16 w16cex w16sdtdh w16sdtfl w16du wp14">
   <w:abstractNum w:abstractNumId="0" w15:restartNumberingAfterBreak="0">
+    <w:nsid w:val="1AA42C08"/>
+    <w:multiLevelType w:val="hybridMultilevel"/>
+    <w:tmpl w:val="D9A4EA8A"/>
+    <w:lvl w:ilvl="0" w:tplc="04090001">
+      <w:start w:val="1"/>
+      <w:numFmt w:val="bullet"/>
+      <w:lvlText w:val=""/>
+      <w:lvlJc w:val="left"/>
+      <w:pPr>
+        <w:ind w:left="360" w:hanging="360"/>
+      </w:pPr>
+      <w:rPr>
+        <w:rFonts w:ascii="Symbol" w:hAnsi="Symbol" w:hint="default"/>
+      </w:rPr>
+    </w:lvl>
+    <w:lvl w:ilvl="1" w:tplc="04090003" w:tentative="1">
+      <w:start w:val="1"/>
+      <w:numFmt w:val="bullet"/>
+      <w:lvlText w:val="o"/>
+      <w:lvlJc w:val="left"/>
+      <w:pPr>
+        <w:ind w:left="1080" w:hanging="360"/>
+      </w:pPr>
+      <w:rPr>
+        <w:rFonts w:ascii="Courier New" w:hAnsi="Courier New" w:cs="Courier New" w:hint="default"/>
+      </w:rPr>
+    </w:lvl>
+    <w:lvl w:ilvl="2" w:tplc="04090005" w:tentative="1">
+      <w:start w:val="1"/>
+      <w:numFmt w:val="bullet"/>
+      <w:lvlText w:val=""/>
+      <w:lvlJc w:val="left"/>
+      <w:pPr>
+        <w:ind w:left="1800" w:hanging="360"/>
+      </w:pPr>
+      <w:rPr>
+        <w:rFonts w:ascii="Wingdings" w:hAnsi="Wingdings" w:hint="default"/>
+      </w:rPr>
+    </w:lvl>
+    <w:lvl w:ilvl="3" w:tplc="04090001" w:tentative="1">
+      <w:start w:val="1"/>
+      <w:numFmt w:val="bullet"/>
+      <w:lvlText w:val=""/>
+      <w:lvlJc w:val="left"/>
+      <w:pPr>
+        <w:ind w:left="2520" w:hanging="360"/>
+      </w:pPr>
+      <w:rPr>
+        <w:rFonts w:ascii="Symbol" w:hAnsi="Symbol" w:hint="default"/>
+      </w:rPr>
+    </w:lvl>
+    <w:lvl w:ilvl="4" w:tplc="04090003" w:tentative="1">
+      <w:start w:val="1"/>
+      <w:numFmt w:val="bullet"/>
+      <w:lvlText w:val="o"/>
+      <w:lvlJc w:val="left"/>
+      <w:pPr>
+        <w:ind w:left="3240" w:hanging="360"/>
+      </w:pPr>
+      <w:rPr>
+        <w:rFonts w:ascii="Courier New" w:hAnsi="Courier New" w:cs="Courier New" w:hint="default"/>
+      </w:rPr>
+    </w:lvl>
+    <w:lvl w:ilvl="5" w:tplc="04090005" w:tentative="1">
+      <w:start w:val="1"/>
+      <w:numFmt w:val="bullet"/>
+      <w:lvlText w:val=""/>
+      <w:lvlJc w:val="left"/>
+      <w:pPr>
+        <w:ind w:left="3960" w:hanging="360"/>
+      </w:pPr>
+      <w:rPr>
+        <w:rFonts w:ascii="Wingdings" w:hAnsi="Wingdings" w:hint="default"/>
+      </w:rPr>
+    </w:lvl>
+    <w:lvl w:ilvl="6" w:tplc="04090001" w:tentative="1">
+      <w:start w:val="1"/>
+      <w:numFmt w:val="bullet"/>
+      <w:lvlText w:val=""/>
+      <w:lvlJc w:val="left"/>
+      <w:pPr>
+        <w:ind w:left="4680" w:hanging="360"/>
+      </w:pPr>
+      <w:rPr>
+        <w:rFonts w:ascii="Symbol" w:hAnsi="Symbol" w:hint="default"/>
+      </w:rPr>
+    </w:lvl>
+    <w:lvl w:ilvl="7" w:tplc="04090003" w:tentative="1">
+      <w:start w:val="1"/>
+      <w:numFmt w:val="bullet"/>
+      <w:lvlText w:val="o"/>
+      <w:lvlJc w:val="left"/>
+      <w:pPr>
+        <w:ind w:left="5400" w:hanging="360"/>
+      </w:pPr>
+      <w:rPr>
+        <w:rFonts w:ascii="Courier New" w:hAnsi="Courier New" w:cs="Courier New" w:hint="default"/>
+      </w:rPr>
+    </w:lvl>
+    <w:lvl w:ilvl="8" w:tplc="04090005" w:tentative="1">
+      <w:start w:val="1"/>
+      <w:numFmt w:val="bullet"/>
+      <w:lvlText w:val=""/>
+      <w:lvlJc w:val="left"/>
+      <w:pPr>
+        <w:ind w:left="6120" w:hanging="360"/>
+      </w:pPr>
+      <w:rPr>
+        <w:rFonts w:ascii="Wingdings" w:hAnsi="Wingdings" w:hint="default"/>
+      </w:rPr>
+    </w:lvl>
+  </w:abstractNum>
+  <w:abstractNum w:abstractNumId="1" w15:restartNumberingAfterBreak="0">
     <w:nsid w:val="26E30B7A"/>
     <w:multiLevelType w:val="hybridMultilevel"/>
     <w:tmpl w:val="DB085FC0"/>
@@ -430,7 +821,7 @@
       </w:rPr>
     </w:lvl>
   </w:abstractNum>
-  <w:abstractNum w:abstractNumId="1" w15:restartNumberingAfterBreak="0">
+  <w:abstractNum w:abstractNumId="2" w15:restartNumberingAfterBreak="0">
     <w:nsid w:val="27FB12A3"/>
     <w:multiLevelType w:val="hybridMultilevel"/>
     <w:tmpl w:val="587AC274"/>
@@ -543,7 +934,120 @@
       </w:rPr>
     </w:lvl>
   </w:abstractNum>
-  <w:abstractNum w:abstractNumId="2" w15:restartNumberingAfterBreak="0">
+  <w:abstractNum w:abstractNumId="3" w15:restartNumberingAfterBreak="0">
+    <w:nsid w:val="2FCA25BA"/>
+    <w:multiLevelType w:val="hybridMultilevel"/>
+    <w:tmpl w:val="273C8526"/>
+    <w:lvl w:ilvl="0" w:tplc="04090001">
+      <w:start w:val="1"/>
+      <w:numFmt w:val="bullet"/>
+      <w:lvlText w:val=""/>
+      <w:lvlJc w:val="left"/>
+      <w:pPr>
+        <w:ind w:left="360" w:hanging="360"/>
+      </w:pPr>
+      <w:rPr>
+        <w:rFonts w:ascii="Symbol" w:hAnsi="Symbol" w:hint="default"/>
+      </w:rPr>
+    </w:lvl>
+    <w:lvl w:ilvl="1" w:tplc="04090003" w:tentative="1">
+      <w:start w:val="1"/>
+      <w:numFmt w:val="bullet"/>
+      <w:lvlText w:val="o"/>
+      <w:lvlJc w:val="left"/>
+      <w:pPr>
+        <w:ind w:left="1080" w:hanging="360"/>
+      </w:pPr>
+      <w:rPr>
+        <w:rFonts w:ascii="Courier New" w:hAnsi="Courier New" w:cs="Courier New" w:hint="default"/>
+      </w:rPr>
+    </w:lvl>
+    <w:lvl w:ilvl="2" w:tplc="04090005" w:tentative="1">
+      <w:start w:val="1"/>
+      <w:numFmt w:val="bullet"/>
+      <w:lvlText w:val=""/>
+      <w:lvlJc w:val="left"/>
+      <w:pPr>
+        <w:ind w:left="1800" w:hanging="360"/>
+      </w:pPr>
+      <w:rPr>
+        <w:rFonts w:ascii="Wingdings" w:hAnsi="Wingdings" w:hint="default"/>
+      </w:rPr>
+    </w:lvl>
+    <w:lvl w:ilvl="3" w:tplc="04090001" w:tentative="1">
+      <w:start w:val="1"/>
+      <w:numFmt w:val="bullet"/>
+      <w:lvlText w:val=""/>
+      <w:lvlJc w:val="left"/>
+      <w:pPr>
+        <w:ind w:left="2520" w:hanging="360"/>
+      </w:pPr>
+      <w:rPr>
+        <w:rFonts w:ascii="Symbol" w:hAnsi="Symbol" w:hint="default"/>
+      </w:rPr>
+    </w:lvl>
+    <w:lvl w:ilvl="4" w:tplc="04090003" w:tentative="1">
+      <w:start w:val="1"/>
+      <w:numFmt w:val="bullet"/>
+      <w:lvlText w:val="o"/>
+      <w:lvlJc w:val="left"/>
+      <w:pPr>
+        <w:ind w:left="3240" w:hanging="360"/>
+      </w:pPr>
+      <w:rPr>
+        <w:rFonts w:ascii="Courier New" w:hAnsi="Courier New" w:cs="Courier New" w:hint="default"/>
+      </w:rPr>
+    </w:lvl>
+    <w:lvl w:ilvl="5" w:tplc="04090005" w:tentative="1">
+      <w:start w:val="1"/>
+      <w:numFmt w:val="bullet"/>
+      <w:lvlText w:val=""/>
+      <w:lvlJc w:val="left"/>
+      <w:pPr>
+        <w:ind w:left="3960" w:hanging="360"/>
+      </w:pPr>
+      <w:rPr>
+        <w:rFonts w:ascii="Wingdings" w:hAnsi="Wingdings" w:hint="default"/>
+      </w:rPr>
+    </w:lvl>
+    <w:lvl w:ilvl="6" w:tplc="04090001" w:tentative="1">
+      <w:start w:val="1"/>
+      <w:numFmt w:val="bullet"/>
+      <w:lvlText w:val=""/>
+      <w:lvlJc w:val="left"/>
+      <w:pPr>
+        <w:ind w:left="4680" w:hanging="360"/>
+      </w:pPr>
+      <w:rPr>
+        <w:rFonts w:ascii="Symbol" w:hAnsi="Symbol" w:hint="default"/>
+      </w:rPr>
+    </w:lvl>
+    <w:lvl w:ilvl="7" w:tplc="04090003" w:tentative="1">
+      <w:start w:val="1"/>
+      <w:numFmt w:val="bullet"/>
+      <w:lvlText w:val="o"/>
+      <w:lvlJc w:val="left"/>
+      <w:pPr>
+        <w:ind w:left="5400" w:hanging="360"/>
+      </w:pPr>
+      <w:rPr>
+        <w:rFonts w:ascii="Courier New" w:hAnsi="Courier New" w:cs="Courier New" w:hint="default"/>
+      </w:rPr>
+    </w:lvl>
+    <w:lvl w:ilvl="8" w:tplc="04090005" w:tentative="1">
+      <w:start w:val="1"/>
+      <w:numFmt w:val="bullet"/>
+      <w:lvlText w:val=""/>
+      <w:lvlJc w:val="left"/>
+      <w:pPr>
+        <w:ind w:left="6120" w:hanging="360"/>
+      </w:pPr>
+      <w:rPr>
+        <w:rFonts w:ascii="Wingdings" w:hAnsi="Wingdings" w:hint="default"/>
+      </w:rPr>
+    </w:lvl>
+  </w:abstractNum>
+  <w:abstractNum w:abstractNumId="4" w15:restartNumberingAfterBreak="0">
     <w:nsid w:val="518B11B6"/>
     <w:multiLevelType w:val="hybridMultilevel"/>
     <w:tmpl w:val="4AC4D8E4"/>
@@ -656,7 +1160,233 @@
       </w:rPr>
     </w:lvl>
   </w:abstractNum>
-  <w:abstractNum w:abstractNumId="3" w15:restartNumberingAfterBreak="0">
+  <w:abstractNum w:abstractNumId="5" w15:restartNumberingAfterBreak="0">
+    <w:nsid w:val="5F895FF3"/>
+    <w:multiLevelType w:val="hybridMultilevel"/>
+    <w:tmpl w:val="794CCFBA"/>
+    <w:lvl w:ilvl="0" w:tplc="04090001">
+      <w:start w:val="1"/>
+      <w:numFmt w:val="bullet"/>
+      <w:lvlText w:val=""/>
+      <w:lvlJc w:val="left"/>
+      <w:pPr>
+        <w:ind w:left="360" w:hanging="360"/>
+      </w:pPr>
+      <w:rPr>
+        <w:rFonts w:ascii="Symbol" w:hAnsi="Symbol" w:hint="default"/>
+      </w:rPr>
+    </w:lvl>
+    <w:lvl w:ilvl="1" w:tplc="04090003" w:tentative="1">
+      <w:start w:val="1"/>
+      <w:numFmt w:val="bullet"/>
+      <w:lvlText w:val="o"/>
+      <w:lvlJc w:val="left"/>
+      <w:pPr>
+        <w:ind w:left="1080" w:hanging="360"/>
+      </w:pPr>
+      <w:rPr>
+        <w:rFonts w:ascii="Courier New" w:hAnsi="Courier New" w:cs="Courier New" w:hint="default"/>
+      </w:rPr>
+    </w:lvl>
+    <w:lvl w:ilvl="2" w:tplc="04090005" w:tentative="1">
+      <w:start w:val="1"/>
+      <w:numFmt w:val="bullet"/>
+      <w:lvlText w:val=""/>
+      <w:lvlJc w:val="left"/>
+      <w:pPr>
+        <w:ind w:left="1800" w:hanging="360"/>
+      </w:pPr>
+      <w:rPr>
+        <w:rFonts w:ascii="Wingdings" w:hAnsi="Wingdings" w:hint="default"/>
+      </w:rPr>
+    </w:lvl>
+    <w:lvl w:ilvl="3" w:tplc="04090001" w:tentative="1">
+      <w:start w:val="1"/>
+      <w:numFmt w:val="bullet"/>
+      <w:lvlText w:val=""/>
+      <w:lvlJc w:val="left"/>
+      <w:pPr>
+        <w:ind w:left="2520" w:hanging="360"/>
+      </w:pPr>
+      <w:rPr>
+        <w:rFonts w:ascii="Symbol" w:hAnsi="Symbol" w:hint="default"/>
+      </w:rPr>
+    </w:lvl>
+    <w:lvl w:ilvl="4" w:tplc="04090003" w:tentative="1">
+      <w:start w:val="1"/>
+      <w:numFmt w:val="bullet"/>
+      <w:lvlText w:val="o"/>
+      <w:lvlJc w:val="left"/>
+      <w:pPr>
+        <w:ind w:left="3240" w:hanging="360"/>
+      </w:pPr>
+      <w:rPr>
+        <w:rFonts w:ascii="Courier New" w:hAnsi="Courier New" w:cs="Courier New" w:hint="default"/>
+      </w:rPr>
+    </w:lvl>
+    <w:lvl w:ilvl="5" w:tplc="04090005" w:tentative="1">
+      <w:start w:val="1"/>
+      <w:numFmt w:val="bullet"/>
+      <w:lvlText w:val=""/>
+      <w:lvlJc w:val="left"/>
+      <w:pPr>
+        <w:ind w:left="3960" w:hanging="360"/>
+      </w:pPr>
+      <w:rPr>
+        <w:rFonts w:ascii="Wingdings" w:hAnsi="Wingdings" w:hint="default"/>
+      </w:rPr>
+    </w:lvl>
+    <w:lvl w:ilvl="6" w:tplc="04090001" w:tentative="1">
+      <w:start w:val="1"/>
+      <w:numFmt w:val="bullet"/>
+      <w:lvlText w:val=""/>
+      <w:lvlJc w:val="left"/>
+      <w:pPr>
+        <w:ind w:left="4680" w:hanging="360"/>
+      </w:pPr>
+      <w:rPr>
+        <w:rFonts w:ascii="Symbol" w:hAnsi="Symbol" w:hint="default"/>
+      </w:rPr>
+    </w:lvl>
+    <w:lvl w:ilvl="7" w:tplc="04090003" w:tentative="1">
+      <w:start w:val="1"/>
+      <w:numFmt w:val="bullet"/>
+      <w:lvlText w:val="o"/>
+      <w:lvlJc w:val="left"/>
+      <w:pPr>
+        <w:ind w:left="5400" w:hanging="360"/>
+      </w:pPr>
+      <w:rPr>
+        <w:rFonts w:ascii="Courier New" w:hAnsi="Courier New" w:cs="Courier New" w:hint="default"/>
+      </w:rPr>
+    </w:lvl>
+    <w:lvl w:ilvl="8" w:tplc="04090005" w:tentative="1">
+      <w:start w:val="1"/>
+      <w:numFmt w:val="bullet"/>
+      <w:lvlText w:val=""/>
+      <w:lvlJc w:val="left"/>
+      <w:pPr>
+        <w:ind w:left="6120" w:hanging="360"/>
+      </w:pPr>
+      <w:rPr>
+        <w:rFonts w:ascii="Wingdings" w:hAnsi="Wingdings" w:hint="default"/>
+      </w:rPr>
+    </w:lvl>
+  </w:abstractNum>
+  <w:abstractNum w:abstractNumId="6" w15:restartNumberingAfterBreak="0">
+    <w:nsid w:val="68C52DDD"/>
+    <w:multiLevelType w:val="hybridMultilevel"/>
+    <w:tmpl w:val="877C09A0"/>
+    <w:lvl w:ilvl="0" w:tplc="04090001">
+      <w:start w:val="1"/>
+      <w:numFmt w:val="bullet"/>
+      <w:lvlText w:val=""/>
+      <w:lvlJc w:val="left"/>
+      <w:pPr>
+        <w:ind w:left="360" w:hanging="360"/>
+      </w:pPr>
+      <w:rPr>
+        <w:rFonts w:ascii="Symbol" w:hAnsi="Symbol" w:hint="default"/>
+      </w:rPr>
+    </w:lvl>
+    <w:lvl w:ilvl="1" w:tplc="04090003" w:tentative="1">
+      <w:start w:val="1"/>
+      <w:numFmt w:val="bullet"/>
+      <w:lvlText w:val="o"/>
+      <w:lvlJc w:val="left"/>
+      <w:pPr>
+        <w:ind w:left="1080" w:hanging="360"/>
+      </w:pPr>
+      <w:rPr>
+        <w:rFonts w:ascii="Courier New" w:hAnsi="Courier New" w:cs="Courier New" w:hint="default"/>
+      </w:rPr>
+    </w:lvl>
+    <w:lvl w:ilvl="2" w:tplc="04090005" w:tentative="1">
+      <w:start w:val="1"/>
+      <w:numFmt w:val="bullet"/>
+      <w:lvlText w:val=""/>
+      <w:lvlJc w:val="left"/>
+      <w:pPr>
+        <w:ind w:left="1800" w:hanging="360"/>
+      </w:pPr>
+      <w:rPr>
+        <w:rFonts w:ascii="Wingdings" w:hAnsi="Wingdings" w:hint="default"/>
+      </w:rPr>
+    </w:lvl>
+    <w:lvl w:ilvl="3" w:tplc="04090001" w:tentative="1">
+      <w:start w:val="1"/>
+      <w:numFmt w:val="bullet"/>
+      <w:lvlText w:val=""/>
+      <w:lvlJc w:val="left"/>
+      <w:pPr>
+        <w:ind w:left="2520" w:hanging="360"/>
+      </w:pPr>
+      <w:rPr>
+        <w:rFonts w:ascii="Symbol" w:hAnsi="Symbol" w:hint="default"/>
+      </w:rPr>
+    </w:lvl>
+    <w:lvl w:ilvl="4" w:tplc="04090003" w:tentative="1">
+      <w:start w:val="1"/>
+      <w:numFmt w:val="bullet"/>
+      <w:lvlText w:val="o"/>
+      <w:lvlJc w:val="left"/>
+      <w:pPr>
+        <w:ind w:left="3240" w:hanging="360"/>
+      </w:pPr>
+      <w:rPr>
+        <w:rFonts w:ascii="Courier New" w:hAnsi="Courier New" w:cs="Courier New" w:hint="default"/>
+      </w:rPr>
+    </w:lvl>
+    <w:lvl w:ilvl="5" w:tplc="04090005" w:tentative="1">
+      <w:start w:val="1"/>
+      <w:numFmt w:val="bullet"/>
+      <w:lvlText w:val=""/>
+      <w:lvlJc w:val="left"/>
+      <w:pPr>
+        <w:ind w:left="3960" w:hanging="360"/>
+      </w:pPr>
+      <w:rPr>
+        <w:rFonts w:ascii="Wingdings" w:hAnsi="Wingdings" w:hint="default"/>
+      </w:rPr>
+    </w:lvl>
+    <w:lvl w:ilvl="6" w:tplc="04090001" w:tentative="1">
+      <w:start w:val="1"/>
+      <w:numFmt w:val="bullet"/>
+      <w:lvlText w:val=""/>
+      <w:lvlJc w:val="left"/>
+      <w:pPr>
+        <w:ind w:left="4680" w:hanging="360"/>
+      </w:pPr>
+      <w:rPr>
+        <w:rFonts w:ascii="Symbol" w:hAnsi="Symbol" w:hint="default"/>
+      </w:rPr>
+    </w:lvl>
+    <w:lvl w:ilvl="7" w:tplc="04090003" w:tentative="1">
+      <w:start w:val="1"/>
+      <w:numFmt w:val="bullet"/>
+      <w:lvlText w:val="o"/>
+      <w:lvlJc w:val="left"/>
+      <w:pPr>
+        <w:ind w:left="5400" w:hanging="360"/>
+      </w:pPr>
+      <w:rPr>
+        <w:rFonts w:ascii="Courier New" w:hAnsi="Courier New" w:cs="Courier New" w:hint="default"/>
+      </w:rPr>
+    </w:lvl>
+    <w:lvl w:ilvl="8" w:tplc="04090005" w:tentative="1">
+      <w:start w:val="1"/>
+      <w:numFmt w:val="bullet"/>
+      <w:lvlText w:val=""/>
+      <w:lvlJc w:val="left"/>
+      <w:pPr>
+        <w:ind w:left="6120" w:hanging="360"/>
+      </w:pPr>
+      <w:rPr>
+        <w:rFonts w:ascii="Wingdings" w:hAnsi="Wingdings" w:hint="default"/>
+      </w:rPr>
+    </w:lvl>
+  </w:abstractNum>
+  <w:abstractNum w:abstractNumId="7" w15:restartNumberingAfterBreak="0">
     <w:nsid w:val="6E48174A"/>
     <w:multiLevelType w:val="hybridMultilevel"/>
     <w:tmpl w:val="3AE49FE6"/>
@@ -770,16 +1500,28 @@
     </w:lvl>
   </w:abstractNum>
   <w:num w:numId="1" w16cid:durableId="1911647124">
+    <w:abstractNumId w:val="7"/>
+  </w:num>
+  <w:num w:numId="2" w16cid:durableId="1510367877">
+    <w:abstractNumId w:val="4"/>
+  </w:num>
+  <w:num w:numId="3" w16cid:durableId="641037714">
+    <w:abstractNumId w:val="2"/>
+  </w:num>
+  <w:num w:numId="4" w16cid:durableId="121847419">
+    <w:abstractNumId w:val="1"/>
+  </w:num>
+  <w:num w:numId="5" w16cid:durableId="1855345403">
     <w:abstractNumId w:val="3"/>
   </w:num>
-  <w:num w:numId="2" w16cid:durableId="1510367877">
-    <w:abstractNumId w:val="2"/>
+  <w:num w:numId="6" w16cid:durableId="1380397358">
+    <w:abstractNumId w:val="5"/>
   </w:num>
-  <w:num w:numId="3" w16cid:durableId="641037714">
-    <w:abstractNumId w:val="1"/>
+  <w:num w:numId="7" w16cid:durableId="376777337">
+    <w:abstractNumId w:val="0"/>
   </w:num>
-  <w:num w:numId="4" w16cid:durableId="121847419">
-    <w:abstractNumId w:val="0"/>
+  <w:num w:numId="8" w16cid:durableId="315845354">
+    <w:abstractNumId w:val="6"/>
   </w:num>
 </w:numbering>
 </file>

</xml_diff>